<commit_message>
Fold the sent Belahcen letter back in, with two repairs
The version prepared for Anouar dropped the date, addressee block and
subject line, so the letter no longer identified which proposal it
supported; those are restored. Its opening sentence was ungrammatical
and is rewritten, and the following paragraph no longer echoes it.
His filled-in details are kept, with the years of experience left as a
bracket for him to confirm.

The other eight emails take the better wording used in the sent one:
the introductory chapter and table of contents are described as what
goes to the publisher, and the co-authors are named in the first
sentence.

Co-Authored-By: Claude Opus 5 <noreply@anthropic.com>
Claude-Session: https://claude.ai/code/session_01YTsySEafbpGxYLQMAGUGjT
</commit_message>
<xml_diff>
--- a/chapter1/Invitation_Emails.docx
+++ b/chapter1/Invitation_Emails.docx
@@ -61,7 +61,7 @@
         <w:jc w:val="both"/>
       </w:pPr>
       <w:r>
-        <w:t>Chapter 1 and the annotated table of contents are not being circulated until the</w:t>
+        <w:t>Chapter 1 and the annotated table of contents go to the publisher, not to the invitees,</w:t>
       </w:r>
     </w:p>
     <w:p>
@@ -69,7 +69,7 @@
         <w:jc w:val="both"/>
       </w:pPr>
       <w:r>
-        <w:t>structure is settled, so each email carries its own description of the invitee's part</w:t>
+        <w:t>so each email carries its own description of the invitee's part instead. When those</w:t>
       </w:r>
     </w:p>
     <w:p>
@@ -77,7 +77,7 @@
         <w:jc w:val="both"/>
       </w:pPr>
       <w:r>
-        <w:t>and offers a conversation instead. That is the better trade anyway: a call recruits</w:t>
+        <w:t>documents do eventually circulate, delete the Status column from the contributor table</w:t>
       </w:r>
     </w:p>
     <w:p>
@@ -85,7 +85,7 @@
         <w:jc w:val="both"/>
       </w:pPr>
       <w:r>
-        <w:t>more reliably than an attachment, and it lets the invitee ask what the commitment</w:t>
+        <w:t>first, so that nobody reads that a colleague is "suggested".</w:t>
       </w:r>
     </w:p>
     <w:p>
@@ -93,7 +93,13 @@
         <w:jc w:val="both"/>
       </w:pPr>
       <w:r>
-        <w:t>really is.</w:t>
+        <w:rPr>
+          <w:b/>
+        </w:rPr>
+        <w:t>Tailor the opening.</w:t>
+      </w:r>
+      <w:r>
+        <w:t xml:space="preserve"> The Belahcen email that went out added a personal line after the</w:t>
       </w:r>
     </w:p>
     <w:p>
@@ -101,7 +107,7 @@
         <w:jc w:val="both"/>
       </w:pPr>
       <w:r>
-        <w:t>When the documents do go out, delete the Status column from the contributor table</w:t>
+        <w:t>first sentence — that the topic is closely aligned with a project the two already share.</w:t>
       </w:r>
     </w:p>
     <w:p>
@@ -109,7 +115,45 @@
         <w:jc w:val="both"/>
       </w:pPr>
       <w:r>
-        <w:t>first, so that nobody reads that a colleague is "suggested".</w:t>
+        <w:t>One such sentence, specific to the recipient, is worth more than any amount of template.</w:t>
+      </w:r>
+    </w:p>
+    <w:p>
+      <w:pPr>
+        <w:jc w:val="both"/>
+      </w:pPr>
+      <w:r>
+        <w:rPr>
+          <w:b/>
+        </w:rPr>
+        <w:t>Personalise the attached letter too.</w:t>
+      </w:r>
+      <w:r>
+        <w:t xml:space="preserve"> Send each invitee a draft with their own name,</w:t>
+      </w:r>
+    </w:p>
+    <w:p>
+      <w:pPr>
+        <w:jc w:val="both"/>
+      </w:pPr>
+      <w:r>
+        <w:t>department and field already filled in, as was done for Belahcen, rather than a form with</w:t>
+      </w:r>
+    </w:p>
+    <w:p>
+      <w:pPr>
+        <w:jc w:val="both"/>
+      </w:pPr>
+      <w:r>
+        <w:t>brackets. It is easier to correct a draft than to compose one, so more of them come back.</w:t>
+      </w:r>
+    </w:p>
+    <w:p>
+      <w:pPr>
+        <w:jc w:val="both"/>
+      </w:pPr>
+      <w:r>
+        <w:t>Any factual claim about the person's own record stays a bracket for them to confirm.</w:t>
       </w:r>
     </w:p>
     <w:p>
@@ -160,7 +204,7 @@
         <w:jc w:val="both"/>
       </w:pPr>
       <w:r>
-        <w:t>We are preparing a proposal to Wiley-IEEE Press for a new book on high-speed electrical machines, and we would like you to contribute to it.</w:t>
+        <w:t>We are preparing a proposal to Wiley-IEEE Press for a new book on high-speed electrical machines together with Ilya Petrov and Juha Pyrhönen, and we would like you to contribute to it.</w:t>
       </w:r>
     </w:p>
     <w:p>
@@ -168,7 +212,7 @@
         <w:jc w:val="both"/>
       </w:pPr>
       <w:r>
-        <w:t>We have begun outlining the book, but we will wait for the publisher's approval before we start writing it. A complete introductory chapter and a full annotated table of contents are already written. We would rather not circulate them until the structure is settled, but I would gladly take you through the plan, and the part of it that concerns you, by phone or in a meeting.</w:t>
+        <w:t>We started outlining the book, but we will wait for the publisher's approval before we start writing it. For the book proposal, we will initially submit a complete introductory chapter and an annotated table of contents.</w:t>
       </w:r>
     </w:p>
     <w:p>
@@ -256,7 +300,7 @@
         <w:jc w:val="both"/>
       </w:pPr>
       <w:r>
-        <w:t>We have begun outlining the book, but we will wait for the publisher's approval before we start writing it. A complete introductory chapter and a full annotated table of contents are already written. We would rather not circulate them until the structure is settled, but I would gladly take you through the plan, and the part of it that concerns you, by phone or in a meeting.</w:t>
+        <w:t>We started outlining the book, but we will wait for the publisher's approval before we start writing it. For the book proposal, we will initially submit a complete introductory chapter and an annotated table of contents.</w:t>
       </w:r>
     </w:p>
     <w:p>
@@ -325,7 +369,7 @@
         <w:jc w:val="both"/>
       </w:pPr>
       <w:r>
-        <w:t>We are preparing a proposal to Wiley-IEEE Press for a new book on high-speed electrical machines, and we would like you to contribute to it.</w:t>
+        <w:t>We are preparing a proposal to Wiley-IEEE Press for a new book on high-speed electrical machines together with Ilya Petrov and Juha Pyrhönen, and we would like you to contribute to it.</w:t>
       </w:r>
     </w:p>
     <w:p>
@@ -333,7 +377,7 @@
         <w:jc w:val="both"/>
       </w:pPr>
       <w:r>
-        <w:t>We have begun outlining the book, but we will wait for the publisher's approval before we start writing it. A complete introductory chapter and a full annotated table of contents are already written. We would rather not circulate them until the structure is settled, but I would gladly take you through the plan, and the part of it that concerns you, by phone or in a meeting.</w:t>
+        <w:t>We started outlining the book, but we will wait for the publisher's approval before we start writing it. For the book proposal, we will initially submit a complete introductory chapter and an annotated table of contents.</w:t>
       </w:r>
     </w:p>
     <w:p>
@@ -410,7 +454,7 @@
         <w:jc w:val="both"/>
       </w:pPr>
       <w:r>
-        <w:t>We are preparing a proposal to Wiley-IEEE Press for a new book on high-speed electrical machines, and we would like you to contribute to it.</w:t>
+        <w:t>We are preparing a proposal to Wiley-IEEE Press for a new book on high-speed electrical machines together with Ilya Petrov and Juha Pyrhönen, and we would like you to contribute to it.</w:t>
       </w:r>
     </w:p>
     <w:p>
@@ -418,7 +462,7 @@
         <w:jc w:val="both"/>
       </w:pPr>
       <w:r>
-        <w:t>We have begun outlining the book, but we will wait for the publisher's approval before we start writing it. A complete introductory chapter and a full annotated table of contents are already written. We would rather not circulate them until the structure is settled, but I would gladly take you through the plan, and the part of it that concerns you, by phone or in a meeting.</w:t>
+        <w:t>We started outlining the book, but we will wait for the publisher's approval before we start writing it. For the book proposal, we will initially submit a complete introductory chapter and an annotated table of contents.</w:t>
       </w:r>
     </w:p>
     <w:p>
@@ -487,7 +531,7 @@
         <w:jc w:val="both"/>
       </w:pPr>
       <w:r>
-        <w:t>We are preparing a proposal to Wiley-IEEE Press for a new book on high-speed electrical machines, and we would like you to contribute to it.</w:t>
+        <w:t>We are preparing a proposal to Wiley-IEEE Press for a new book on high-speed electrical machines together with Ilya Petrov and Juha Pyrhönen, and we would like you to contribute to it.</w:t>
       </w:r>
     </w:p>
     <w:p>
@@ -495,7 +539,7 @@
         <w:jc w:val="both"/>
       </w:pPr>
       <w:r>
-        <w:t>We have begun outlining the book, but we will wait for the publisher's approval before we start writing it. A complete introductory chapter and a full annotated table of contents are already written. We would rather not circulate them until the structure is settled, but I would gladly take you through the plan, and the part of it that concerns you, by phone or in a meeting.</w:t>
+        <w:t>We started outlining the book, but we will wait for the publisher's approval before we start writing it. For the book proposal, we will initially submit a complete introductory chapter and an annotated table of contents.</w:t>
       </w:r>
     </w:p>
     <w:p>
@@ -564,7 +608,7 @@
         <w:jc w:val="both"/>
       </w:pPr>
       <w:r>
-        <w:t>We are preparing a proposal to Wiley-IEEE Press for a new book on high-speed electrical machines, and we would like you to contribute to it.</w:t>
+        <w:t>We are preparing a proposal to Wiley-IEEE Press for a new book on high-speed electrical machines together with Ilya Petrov and Juha Pyrhönen, and we would like you to contribute to it.</w:t>
       </w:r>
     </w:p>
     <w:p>
@@ -572,7 +616,7 @@
         <w:jc w:val="both"/>
       </w:pPr>
       <w:r>
-        <w:t>We have begun outlining the book, but we will wait for the publisher's approval before we start writing it. A complete introductory chapter and a full annotated table of contents are already written. We would rather not circulate them until the structure is settled, but I would gladly take you through the plan, and the part of it that concerns you, by phone or in a meeting.</w:t>
+        <w:t>We started outlining the book, but we will wait for the publisher's approval before we start writing it. For the book proposal, we will initially submit a complete introductory chapter and an annotated table of contents.</w:t>
       </w:r>
     </w:p>
     <w:p>
@@ -652,7 +696,7 @@
         <w:jc w:val="both"/>
       </w:pPr>
       <w:r>
-        <w:t>We are preparing a proposal to Wiley-IEEE Press for a new book on high-speed electrical machines, and we would like you to contribute to it.</w:t>
+        <w:t>We are preparing a proposal to Wiley-IEEE Press for a new book on high-speed electrical machines together with Ilya Petrov and Juha Pyrhönen, and we would like you to contribute to it.</w:t>
       </w:r>
     </w:p>
     <w:p>
@@ -660,7 +704,7 @@
         <w:jc w:val="both"/>
       </w:pPr>
       <w:r>
-        <w:t>We have begun outlining the book, but we will wait for the publisher's approval before we start writing it. A complete introductory chapter and a full annotated table of contents are already written. We would rather not circulate them until the structure is settled, but I would gladly take you through the plan, and the part of it that concerns you, by phone or in a meeting.</w:t>
+        <w:t>We started outlining the book, but we will wait for the publisher's approval before we start writing it. For the book proposal, we will initially submit a complete introductory chapter and an annotated table of contents.</w:t>
       </w:r>
     </w:p>
     <w:p>
@@ -740,7 +784,7 @@
         <w:jc w:val="both"/>
       </w:pPr>
       <w:r>
-        <w:t>We are preparing a proposal to Wiley-IEEE Press for a new book on high-speed electrical machines, and we would like you to contribute to it.</w:t>
+        <w:t>We are preparing a proposal to Wiley-IEEE Press for a new book on high-speed electrical machines together with Ilya Petrov and Juha Pyrhönen, and we would like you to contribute to it.</w:t>
       </w:r>
     </w:p>
     <w:p>
@@ -748,7 +792,7 @@
         <w:jc w:val="both"/>
       </w:pPr>
       <w:r>
-        <w:t>We have begun outlining the book, but we will wait for the publisher's approval before we start writing it. A complete introductory chapter and a full annotated table of contents are already written. We would rather not circulate them until the structure is settled, but I would gladly take you through the plan, and the part of it that concerns you, by phone or in a meeting.</w:t>
+        <w:t>We started outlining the book, but we will wait for the publisher's approval before we start writing it. For the book proposal, we will initially submit a complete introductory chapter and an annotated table of contents.</w:t>
       </w:r>
     </w:p>
     <w:p>
@@ -817,7 +861,7 @@
         <w:jc w:val="both"/>
       </w:pPr>
       <w:r>
-        <w:t>We are preparing a proposal to Wiley-IEEE Press for a new book on high-speed electrical machines, and we would like you to contribute to it.</w:t>
+        <w:t>We are preparing a proposal to Wiley-IEEE Press for a new book on high-speed electrical machines together with Ilya Petrov and Juha Pyrhönen, and we would like you to contribute to it.</w:t>
       </w:r>
     </w:p>
     <w:p>
@@ -825,7 +869,7 @@
         <w:jc w:val="both"/>
       </w:pPr>
       <w:r>
-        <w:t>We have begun outlining the book, but we will wait for the publisher's approval before we start writing it. A complete introductory chapter and a full annotated table of contents are already written. We would rather not circulate them until the structure is settled, but I would gladly take you through the plan, and the part of it that concerns you, by phone or in a meeting.</w:t>
+        <w:t>We started outlining the book, but we will wait for the publisher's approval before we start writing it. For the book proposal, we will initially submit a complete introductory chapter and an annotated table of contents.</w:t>
       </w:r>
     </w:p>
     <w:p>

</xml_diff>

<commit_message>
Letter of support and invitation for J. Sopanen
His letter argues the need from machine dynamics rather than repeating
Belahcen's case: a rotor reaches mechanical assessment with its diameter
and active length already fixed, so the constraints must enter at the
start, and the turbomachinery and electrical-machine literatures do not
meet over a rotor that is also a magnetic circuit. Deliberately makes a
different argument from the loss letter so the set does not read as
coordinated.

His email now records that he agreed at the CoE meeting and asks which
members of his group will write.

Co-Authored-By: Claude Opus 5 <noreply@anthropic.com>
Claude-Session: https://claude.ai/code/session_01YTsySEafbpGxYLQMAGUGjT
</commit_message>
<xml_diff>
--- a/chapter1/Invitation_Emails.docx
+++ b/chapter1/Invitation_Emails.docx
@@ -276,7 +276,7 @@
         <w:rPr>
           <w:i/>
         </w:rPr>
-        <w:t>He has already supported the idea, so this confirms rather than asks.</w:t>
+        <w:t>He agreed to contribute at the CoE meeting, so this confirms rather than asks.</w:t>
       </w:r>
     </w:p>
     <w:p>
@@ -292,7 +292,7 @@
         <w:jc w:val="both"/>
       </w:pPr>
       <w:r>
-        <w:t>Thank you again for supporting the idea when we spoke. We are now putting the proposal to Wiley-IEEE Press together, and I would like to confirm what we discussed.</w:t>
+        <w:t>Thank you again for supporting the book idea at the last CoE meeting and for agreeing to contribute. We are now putting the proposal to Wiley-IEEE Press together with Ilya Petrov and Juha Pyrhönen, and I would like to confirm the part we hope you will take.</w:t>
       </w:r>
     </w:p>
     <w:p>
@@ -316,7 +316,7 @@
         <w:jc w:val="both"/>
       </w:pPr>
       <w:r>
-        <w:t>Two things would help now. Could you write us a short letter of support, which we would send to the publisher together with the proposal? A sample is attached, which you are free to change as you wish. And could you tell us which members of your group are likely to write, so that we can name them in the proposal?</w:t>
+        <w:t>Two things would help now. Could you write us a short letter of support? We would send it to the publisher together with the proposal, and we think such letters will make the application considerably stronger. A draft is attached, which you are free to change as you wish. And could you tell us which members of your group are likely to write? Naming them in the proposal would strengthen it further.</w:t>
       </w:r>
     </w:p>
     <w:p>
@@ -324,7 +324,7 @@
         <w:jc w:val="both"/>
       </w:pPr>
       <w:r>
-        <w:t>Could you let us know by [date]? We plan to submit on [date].</w:t>
+        <w:t>Looking forward to hearing from you.</w:t>
       </w:r>
     </w:p>
     <w:p>
@@ -332,15 +332,7 @@
         <w:jc w:val="both"/>
       </w:pPr>
       <w:r>
-        <w:t>Best regards,</w:t>
-      </w:r>
-    </w:p>
-    <w:p>
-      <w:pPr>
-        <w:jc w:val="both"/>
-      </w:pPr>
-      <w:r>
-        <w:t>[signature]</w:t>
+        <w:t>BR, Hüseyin</w:t>
       </w:r>
     </w:p>
     <w:p>

</xml_diff>

<commit_message>
Email and letter of support for J. Ikaheimo
His email is short because Juha has already made the pitch and had a
yes: it names the three sections, asks him to separate the material he
offered from the writing he offered, and raises the ABB publication
clearance before a contract rather than after. It names chapters rather
than numbers them, since the list Juha sent has since changed.

His letter makes the fourth distinct argument in the set, and the only
commercial one: a design sound on paper can still be unbuildable at an
acceptable scrap rate, and new engineers have no text to learn from, so
manufacturers train them from internal documents and from colleagues
who will retire.

Co-Authored-By: Claude Opus 5 <noreply@anthropic.com>
Claude-Session: https://claude.ai/code/session_01YTsySEafbpGxYLQMAGUGjT
</commit_message>
<xml_diff>
--- a/chapter1/Invitation_Emails.docx
+++ b/chapter1/Invitation_Emails.docx
@@ -418,6 +418,91 @@
       </w:pPr>
       <w:r>
         <w:t>[signature]</w:t>
+      </w:r>
+    </w:p>
+    <w:p>
+      <w:r>
+        <w:br w:type="page"/>
+      </w:r>
+    </w:p>
+    <w:p>
+      <w:pPr>
+        <w:pStyle w:val="Heading2"/>
+      </w:pPr>
+      <w:r>
+        <w:t>Jouni Ikäheimo — solid-rotor machines, manufacture, qualification, photographs</w:t>
+      </w:r>
+    </w:p>
+    <w:p>
+      <w:pPr>
+        <w:jc w:val="both"/>
+      </w:pPr>
+      <w:r>
+        <w:t>*Juha has already pitched the book to him and he has agreed, so this is short: it names</w:t>
+      </w:r>
+    </w:p>
+    <w:p>
+      <w:pPr>
+        <w:jc w:val="both"/>
+      </w:pPr>
+      <w:r>
+        <w:t>the sections, separates "material" from "writing", and raises the ABB clearance.*</w:t>
+      </w:r>
+    </w:p>
+    <w:p>
+      <w:pPr>
+        <w:jc w:val="both"/>
+      </w:pPr>
+      <w:r>
+        <w:t>Hello Jouni,</w:t>
+      </w:r>
+    </w:p>
+    <w:p>
+      <w:pPr>
+        <w:jc w:val="both"/>
+      </w:pPr>
+      <w:r>
+        <w:t>Thank you for the quick and positive reply to Juha. Let me be concrete about the part we hope you will take. The structure has tightened a little since the list Juha sent you, so I will name the chapters rather than number them.</w:t>
+      </w:r>
+    </w:p>
+    <w:p>
+      <w:pPr>
+        <w:jc w:val="both"/>
+      </w:pPr>
+      <w:r>
+        <w:t>Three places. In the chapter on machine topologies, the section on solid-rotor induction machines, which the book treats as the industrial workhorse and which is far better written from the manufacturing side than from the literature. In the industrial case-study chapter, manufacture and tolerance control, and qualification against API 617, API 541 and IEC 60034-25, both from practice rather than from the standards themselves. And the photographs and machine material you offered, which we would use across the whole book; competing titles are illustrated almost entirely with line drawings, so real machines would set ours apart.</w:t>
+      </w:r>
+    </w:p>
+    <w:p>
+      <w:pPr>
+        <w:jc w:val="both"/>
+      </w:pPr>
+      <w:r>
+        <w:t>You offered material and a contribution both, and it would help to know which of the two you want to commit to. It would also help to know early whether ABB would allow the photographs, and any measured data, to be published.</w:t>
+      </w:r>
+    </w:p>
+    <w:p>
+      <w:pPr>
+        <w:jc w:val="both"/>
+      </w:pPr>
+      <w:r>
+        <w:t>Could you also write us a short letter of support? We would send it to the publisher together with the proposal, and we think such letters will make the application considerably stronger. A draft is attached, which you are free to change as you wish.</w:t>
+      </w:r>
+    </w:p>
+    <w:p>
+      <w:pPr>
+        <w:jc w:val="both"/>
+      </w:pPr>
+      <w:r>
+        <w:t>Looking forward to hearing from you.</w:t>
+      </w:r>
+    </w:p>
+    <w:p>
+      <w:pPr>
+        <w:jc w:val="both"/>
+      </w:pPr>
+      <w:r>
+        <w:t>BR, Hüseyin</w:t>
       </w:r>
     </w:p>
     <w:p>

</xml_diff>

<commit_message>
Split the Wrobel approach into two emails
The first asks only whether the subject interests him and attaches
nothing; the letter of support and the proposal material follow once he
has said yes. A pre-written letter arriving from someone he has never
met is easy to read as presumptuous, and it asks him to endorse a plan
he has not seen.

The guidance at the head of the file now distinguishes warm invitations,
where the letter goes in the first email, from cold ones, where it does
not.

Co-Authored-By: Claude Opus 5 <noreply@anthropic.com>
Claude-Session: https://claude.ai/code/session_01YTsySEafbpGxYLQMAGUGjT
</commit_message>
<xml_diff>
--- a/chapter1/Invitation_Emails.docx
+++ b/chapter1/Invitation_Emails.docx
@@ -50,7 +50,61 @@
         <w:rPr>
           <w:b/>
         </w:rPr>
-        <w:t>Attach to every one:</w:t>
+        <w:t>When to ask for the letter.</w:t>
+      </w:r>
+      <w:r>
+        <w:t xml:space="preserve"> Where the invitee already knows the plan, from a meeting, a</w:t>
+      </w:r>
+    </w:p>
+    <w:p>
+      <w:pPr>
+        <w:jc w:val="both"/>
+      </w:pPr>
+      <w:r>
+        <w:t>call, or Juha, ask in the first email and attach the draft: they have the context to judge</w:t>
+      </w:r>
+    </w:p>
+    <w:p>
+      <w:pPr>
+        <w:jc w:val="both"/>
+      </w:pPr>
+      <w:r>
+        <w:t>it. Where the approach is cold, ask only whether the subject interests them, and send the</w:t>
+      </w:r>
+    </w:p>
+    <w:p>
+      <w:pPr>
+        <w:jc w:val="both"/>
+      </w:pPr>
+      <w:r>
+        <w:t>draft letter with Chapter 1 and the table of contents once they have said yes. A</w:t>
+      </w:r>
+    </w:p>
+    <w:p>
+      <w:pPr>
+        <w:jc w:val="both"/>
+      </w:pPr>
+      <w:r>
+        <w:t>pre-written letter from a stranger reads as presumptuous, and it asks someone to endorse a</w:t>
+      </w:r>
+    </w:p>
+    <w:p>
+      <w:pPr>
+        <w:jc w:val="both"/>
+      </w:pPr>
+      <w:r>
+        <w:t>plan they have not seen. Wrobel's entry below shows the two-step form.</w:t>
+      </w:r>
+    </w:p>
+    <w:p>
+      <w:pPr>
+        <w:jc w:val="both"/>
+      </w:pPr>
+      <w:r>
+        <w:rPr>
+          <w:b/>
+        </w:rPr>
+        <w:t>Attach to the warm ones:</w:t>
       </w:r>
       <w:r>
         <w:t xml:space="preserve"> the draft letter of support, and nothing else for the moment.</w:t>
@@ -556,6 +610,46 @@
       </w:pPr>
       <w:r>
         <w:t>book proposal on high-speed machines — invitation to contribute".*</w:t>
+      </w:r>
+    </w:p>
+    <w:p>
+      <w:pPr>
+        <w:jc w:val="both"/>
+      </w:pPr>
+      <w:r>
+        <w:t>*Sent in two steps. The first email asks only whether the subject interests him; the</w:t>
+      </w:r>
+    </w:p>
+    <w:p>
+      <w:pPr>
+        <w:jc w:val="both"/>
+      </w:pPr>
+      <w:r>
+        <w:t>letter of support is not mentioned and nothing is attached. The second follows once he</w:t>
+      </w:r>
+    </w:p>
+    <w:p>
+      <w:pPr>
+        <w:jc w:val="both"/>
+      </w:pPr>
+      <w:r>
+        <w:t>has said yes. A pre-written letter arriving from a stranger is easy to read as</w:t>
+      </w:r>
+    </w:p>
+    <w:p>
+      <w:pPr>
+        <w:jc w:val="both"/>
+      </w:pPr>
+      <w:r>
+        <w:t>presumptuous, and it also asks him to endorse a plan he has not yet seen.*</w:t>
+      </w:r>
+    </w:p>
+    <w:p>
+      <w:pPr>
+        <w:pStyle w:val="Heading3"/>
+      </w:pPr>
+      <w:r>
+        <w:t>First email — is the subject of interest?</w:t>
       </w:r>
     </w:p>
     <w:p>
@@ -604,7 +698,7 @@
         <w:jc w:val="both"/>
       </w:pPr>
       <w:r>
-        <w:t>What we would like to ask you for is the cooling architecture: the heat paths and thermal resistances of the winding, stator cooling from water jackets through in-slot to direct winding cooling, and the rotor side including the sleeve as a thermal barrier. About twelve pages. It is the part of the chapter that dates fastest, and we would much rather have it written by someone working on it now than assembled from the literature. Nothing would be binding until the publisher accepts the proposal, and no writing would begin before then.</w:t>
+        <w:t>What we have in mind for you is the cooling architecture: the heat paths and thermal resistances of the winding, stator cooling from water jackets through in-slot to direct winding cooling, and the rotor side including the sleeve as a thermal barrier. About twelve pages. It is the part of the chapter that dates fastest, and we would much rather have it written by someone working on it now than assembled from the literature.</w:t>
       </w:r>
     </w:p>
     <w:p>
@@ -612,7 +706,7 @@
         <w:jc w:val="both"/>
       </w:pPr>
       <w:r>
-        <w:t>If the idea interests you, I would also ask whether you might write a short letter of support for the proposal. Letters from recognised contributors carry real weight with a publisher's reviewers. I have attached a draft only to show what such a letter usually contains; please treat it as a starting point rather than as a text to sign.</w:t>
+        <w:t>Before going any further I would simply like to know whether the subject interests you. Nothing is binding at this stage: the publisher has not yet seen the proposal, and no writing would begin before a contract is signed. If it does interest you, I would gladly send you the completed introductory chapter and the annotated table of contents, or talk it through in a video call, whichever is easier.</w:t>
       </w:r>
     </w:p>
     <w:p>
@@ -620,7 +714,74 @@
         <w:jc w:val="both"/>
       </w:pPr>
       <w:r>
-        <w:t>I would gladly send you the completed introductory chapter and the annotated table of contents, or talk it through in a video call if that is easier.</w:t>
+        <w:t>Yours sincerely,</w:t>
+      </w:r>
+    </w:p>
+    <w:p>
+      <w:pPr>
+        <w:jc w:val="both"/>
+      </w:pPr>
+      <w:r>
+        <w:t>Hüseyin Canseven</w:t>
+      </w:r>
+    </w:p>
+    <w:p>
+      <w:pPr>
+        <w:jc w:val="both"/>
+      </w:pPr>
+      <w:r>
+        <w:t>LUT University</w:t>
+      </w:r>
+    </w:p>
+    <w:p>
+      <w:pPr>
+        <w:pStyle w:val="Heading3"/>
+      </w:pPr>
+      <w:r>
+        <w:t>Second email — after he has said yes</w:t>
+      </w:r>
+    </w:p>
+    <w:p>
+      <w:pPr>
+        <w:jc w:val="both"/>
+      </w:pPr>
+      <w:r>
+        <w:rPr>
+          <w:i/>
+        </w:rPr>
+        <w:t>Attach Chapter 1, the annotated table of contents, and the draft letter of support.</w:t>
+      </w:r>
+    </w:p>
+    <w:p>
+      <w:pPr>
+        <w:jc w:val="both"/>
+      </w:pPr>
+      <w:r>
+        <w:t>Dear Professor Wrobel,</w:t>
+      </w:r>
+    </w:p>
+    <w:p>
+      <w:pPr>
+        <w:jc w:val="both"/>
+      </w:pPr>
+      <w:r>
+        <w:t>Thank you, I am glad the subject interests you. I attach the completed introductory chapter and the annotated table of contents so that you can see where your sections would sit: §10.2 to §10.4 of the thermal chapter are the ones we have in mind, and Chapter 1 will show you the argument they serve.</w:t>
+      </w:r>
+    </w:p>
+    <w:p>
+      <w:pPr>
+        <w:jc w:val="both"/>
+      </w:pPr>
+      <w:r>
+        <w:t>One further request, if you are willing. We are collecting short letters of support to send to Wiley together with the proposal. Letters from the named contributors carry real weight with a publisher's reviewers, because they show that the people listed exist, have agreed, and see the need for the book from their own field. I attach a draft to show what such a letter usually contains; please change it as you see fit, or write something quite different if you would rather.</w:t>
+      </w:r>
+    </w:p>
+    <w:p>
+      <w:pPr>
+        <w:jc w:val="both"/>
+      </w:pPr>
+      <w:r>
+        <w:t>I would of course be glad to answer any questions about the scope, or to arrange a call.</w:t>
       </w:r>
     </w:p>
     <w:p>

</xml_diff>

<commit_message>
Email and letter of support for L. Aarniovuori
His letter argues the sixth distinct case, from measurement: the
standard efficiency procedures were written for mains-frequency and
conventional converter-fed machines and do not transfer to 30 000
r/min, input-output measurement subtracts two large numbers at an
uncertainty approaching the loss itself, and loss segregation assumes
components that are entangled at kilohertz. The consequence he draws
reaches the proposal directly: published high-speed efficiency figures
are often not comparable, which bounds how good the machine survey in
Chapter 2 can be.

His email states the eleven-page total and notes that a word in person
should come first, since he is a colleague nobody has yet spoken to.

Co-Authored-By: Claude Opus 5 <noreply@anthropic.com>
Claude-Session: https://claude.ai/code/session_01YTsySEafbpGxYLQMAGUGjT
</commit_message>
<xml_diff>
--- a/chapter1/Invitation_Emails.docx
+++ b/chapter1/Invitation_Emails.docx
@@ -975,6 +975,22 @@
         <w:jc w:val="both"/>
       </w:pPr>
       <w:r>
+        <w:t>*A colleague, but nobody has raised the book with him yet. A word in person first would</w:t>
+      </w:r>
+    </w:p>
+    <w:p>
+      <w:pPr>
+        <w:jc w:val="both"/>
+      </w:pPr>
+      <w:r>
+        <w:t>be more natural than a cold mail, with this then recording what was agreed.*</w:t>
+      </w:r>
+    </w:p>
+    <w:p>
+      <w:pPr>
+        <w:jc w:val="both"/>
+      </w:pPr>
+      <w:r>
         <w:t>Hello Lassi,</w:t>
       </w:r>
     </w:p>
@@ -999,7 +1015,7 @@
         <w:jc w:val="both"/>
       </w:pPr>
       <w:r>
-        <w:t>Your contribution would be on the measurement side, in two sections. One is the harmonic losses that a converter deposits in a rotor which the air gap and the retaining sleeve keep thermally isolated, which is why supply harmonics matter more at high speed than at mains frequency. The other is the test rig, the instrumentation and the loss segregation of a high-speed machine, where the electrical methods run out and calorimetry has to take over; we would like that written in enough detail that a reader can repeat it. Everyone who contributes is named at the head of the chapter. Once the publisher has approved the proposal, we will send you the detailed structure.</w:t>
+        <w:t>Your part would be the measurement side, in two places. In the chapter on the drive, the converter harmonics and the rotor heating they cause, which matters far more at high speed than at mains frequency because those losses land in a rotor that the air gap and the retaining sleeve keep thermally isolated. And in the industrial case-study chapter, the test rig, the instrumentation and the loss segregation of a high-speed machine, where the electrical methods run out and calorimetry has to take over. We would like that one written in enough detail that a reader could repeat it, because most books state results without saying how they were obtained. About eleven pages between the two. Everyone who contributes is named at the head of the chapter, and once the publisher has approved the proposal we will send you the detailed structure.</w:t>
       </w:r>
     </w:p>
     <w:p>
@@ -1007,7 +1023,7 @@
         <w:jc w:val="both"/>
       </w:pPr>
       <w:r>
-        <w:t>If you would like to join, could you write us a short letter of support? We would send it to the publisher together with the proposal, and we think such letters will make the application considerably stronger. A sample is attached, which you are free to change as you wish.</w:t>
+        <w:t>Could you write us a short letter of support? We would send it to the publisher together with the proposal, and we think such letters will make the application considerably stronger. A draft is attached, which you are free to change as you wish.</w:t>
       </w:r>
     </w:p>
     <w:p>
@@ -1015,7 +1031,7 @@
         <w:jc w:val="both"/>
       </w:pPr>
       <w:r>
-        <w:t>Could you let us know by [date]? We plan to submit on [date].</w:t>
+        <w:t>Looking forward to hearing from you.</w:t>
       </w:r>
     </w:p>
     <w:p>
@@ -1023,15 +1039,7 @@
         <w:jc w:val="both"/>
       </w:pPr>
       <w:r>
-        <w:t>Best regards,</w:t>
-      </w:r>
-    </w:p>
-    <w:p>
-      <w:pPr>
-        <w:jc w:val="both"/>
-      </w:pPr>
-      <w:r>
-        <w:t>[signature]</w:t>
+        <w:t>BR, Hüseyin</w:t>
       </w:r>
     </w:p>
     <w:p>

</xml_diff>

<commit_message>
Soften the third ask in Saari's email
Replaces the paragraph that asked directly about publication clearance
with one that says what the book actually wants from him: experience of
machines that have been built and put into service, which the
university side cannot supply. It ends on shaping the chapter around
whatever can sensibly be shown, which opens the subject without making
a demand of a first email.

The clearance question still has to be settled before submission, since
the industrial running machine appears from Chapter 2 onwards; the note
above the email says to raise it in the follow-up call instead.

Co-Authored-By: Claude Opus 5 <noreply@anthropic.com>
Claude-Session: https://claude.ai/code/session_01YTsySEafbpGxYLQMAGUGjT
</commit_message>
<xml_diff>
--- a/chapter1/Invitation_Emails.docx
+++ b/chapter1/Invitation_Emails.docx
@@ -423,7 +423,47 @@
         <w:jc w:val="both"/>
       </w:pPr>
       <w:r>
-        <w:t>accepted alone, and the data question raised as the thing to settle first.*</w:t>
+        <w:t>accepted alone.*</w:t>
+      </w:r>
+    </w:p>
+    <w:p>
+      <w:pPr>
+        <w:jc w:val="both"/>
+      </w:pPr>
+      <w:r>
+        <w:t>*The publication clearance for the compressor measurements is deliberately not raised</w:t>
+      </w:r>
+    </w:p>
+    <w:p>
+      <w:pPr>
+        <w:jc w:val="both"/>
+      </w:pPr>
+      <w:r>
+        <w:t>here; the third ask ends on "whatever can sensibly be shown", which opens the subject</w:t>
+      </w:r>
+    </w:p>
+    <w:p>
+      <w:pPr>
+        <w:jc w:val="both"/>
+      </w:pPr>
+      <w:r>
+        <w:t>without making a demand of a first email. It still has to be settled before the proposal</w:t>
+      </w:r>
+    </w:p>
+    <w:p>
+      <w:pPr>
+        <w:jc w:val="both"/>
+      </w:pPr>
+      <w:r>
+        <w:t>goes out, because the industrial running machine appears from Chapter 2 onwards — put it</w:t>
+      </w:r>
+    </w:p>
+    <w:p>
+      <w:pPr>
+        <w:jc w:val="both"/>
+      </w:pPr>
+      <w:r>
+        <w:t>in the follow-up call.*</w:t>
       </w:r>
     </w:p>
     <w:p>
@@ -488,7 +528,7 @@
         <w:jc w:val="both"/>
       </w:pPr>
       <w:r>
-        <w:t>The third we should discuss before anything else. The book carries two machines through every chapter, one industrial and one mobile, from specification to measured performance. For the industrial one we have a gearless compressor drive in mind, and we would like to know whether such a case could come from your work, and whether [company] would allow the measurements to be published. That machine appears from Chapter 2 onwards, so if it cannot be published we would rather know now and choose differently.</w:t>
+        <w:t>The third is the industrial case-study chapter, which closes the book with complete designs carried from specification to measured performance. What would make that chapter worth reading is the experience of machines that have actually been built and put into service, and that is something we cannot supply from the university side. We would be glad to build it around a case you know well, and to shape it around whatever can sensibly be shown.</w:t>
       </w:r>
     </w:p>
     <w:p>

</xml_diff>

<commit_message>
Split Saari's approach into two emails as well
The first asks only whether the idea interests him and attaches
nothing; the letter of support, the proposal material and the case-study
clearance all wait for the second, once he has said yes. He has not met
Huseyin, so the same reasoning applies as for Wrobel: a pre-written
letter from someone a person has not met asks them to endorse a plan
they have not seen.

Co-Authored-By: Claude Opus 5 <noreply@anthropic.com>
Claude-Session: https://claude.ai/code/session_01YTsySEafbpGxYLQMAGUGjT
</commit_message>
<xml_diff>
--- a/chapter1/Invitation_Emails.docx
+++ b/chapter1/Invitation_Emails.docx
@@ -431,7 +431,7 @@
         <w:jc w:val="both"/>
       </w:pPr>
       <w:r>
-        <w:t>*The publication clearance for the compressor measurements is deliberately not raised</w:t>
+        <w:t>*Sent in two steps, as with Wrobel: the first email asks only whether the idea interests</w:t>
       </w:r>
     </w:p>
     <w:p>
@@ -439,7 +439,7 @@
         <w:jc w:val="both"/>
       </w:pPr>
       <w:r>
-        <w:t>here; the third ask ends on "whatever can sensibly be shown", which opens the subject</w:t>
+        <w:t>him and attaches nothing. Two things wait for the second email — the letter of support,</w:t>
       </w:r>
     </w:p>
     <w:p>
@@ -447,7 +447,7 @@
         <w:jc w:val="both"/>
       </w:pPr>
       <w:r>
-        <w:t>without making a demand of a first email. It still has to be settled before the proposal</w:t>
+        <w:t>and the publication clearance for the compressor measurements. The third ask ends on</w:t>
       </w:r>
     </w:p>
     <w:p>
@@ -455,7 +455,7 @@
         <w:jc w:val="both"/>
       </w:pPr>
       <w:r>
-        <w:t>goes out, because the industrial running machine appears from Chapter 2 onwards — put it</w:t>
+        <w:t>"whatever can sensibly be shown", which opens that subject without making a demand of a</w:t>
       </w:r>
     </w:p>
     <w:p>
@@ -463,7 +463,31 @@
         <w:jc w:val="both"/>
       </w:pPr>
       <w:r>
-        <w:t>in the follow-up call.*</w:t>
+        <w:t>first contact. The clearance still has to be settled before the proposal goes out,</w:t>
+      </w:r>
+    </w:p>
+    <w:p>
+      <w:pPr>
+        <w:jc w:val="both"/>
+      </w:pPr>
+      <w:r>
+        <w:t>because the industrial running machine appears from Chapter 2 onwards, so put it on the</w:t>
+      </w:r>
+    </w:p>
+    <w:p>
+      <w:pPr>
+        <w:jc w:val="both"/>
+      </w:pPr>
+      <w:r>
+        <w:t>follow-up call.*</w:t>
+      </w:r>
+    </w:p>
+    <w:p>
+      <w:pPr>
+        <w:pStyle w:val="Heading3"/>
+      </w:pPr>
+      <w:r>
+        <w:t>First email — is the idea of interest?</w:t>
       </w:r>
     </w:p>
     <w:p>
@@ -544,7 +568,7 @@
         <w:jc w:val="both"/>
       </w:pPr>
       <w:r>
-        <w:t>Could you also write us a short letter of support? We would send it to the publisher together with the proposal, and we think such letters will make the application considerably stronger. A draft is attached, which you are free to change as you wish.</w:t>
+        <w:t>Nothing is binding at this stage: the publisher has not yet seen the proposal, and no writing would begin before a contract. For now I would simply like to know whether the idea interests you. I would gladly send you the completed introductory chapter and the annotated table of contents, or talk it through by phone or video, whichever is easier.</w:t>
       </w:r>
     </w:p>
     <w:p>
@@ -561,6 +585,81 @@
       </w:pPr>
       <w:r>
         <w:t>BR, Hüseyin</w:t>
+      </w:r>
+    </w:p>
+    <w:p>
+      <w:pPr>
+        <w:pStyle w:val="Heading3"/>
+      </w:pPr>
+      <w:r>
+        <w:t>Second email — after he has said yes</w:t>
+      </w:r>
+    </w:p>
+    <w:p>
+      <w:pPr>
+        <w:jc w:val="both"/>
+      </w:pPr>
+      <w:r>
+        <w:rPr>
+          <w:i/>
+        </w:rPr>
+        <w:t>Attach Chapter 1, the annotated table of contents, and the draft letter of support.</w:t>
+      </w:r>
+    </w:p>
+    <w:p>
+      <w:pPr>
+        <w:jc w:val="both"/>
+      </w:pPr>
+      <w:r>
+        <w:t>Dear Juha,</w:t>
+      </w:r>
+    </w:p>
+    <w:p>
+      <w:pPr>
+        <w:jc w:val="both"/>
+      </w:pPr>
+      <w:r>
+        <w:t>Thank you, I am very glad you are interested. I attach the completed introductory chapter and the annotated table of contents so that you can see where your sections would sit and what the book is arguing.</w:t>
+      </w:r>
+    </w:p>
+    <w:p>
+      <w:pPr>
+        <w:jc w:val="both"/>
+      </w:pPr>
+      <w:r>
+        <w:t>One further request, if you are willing. We are collecting short letters of support to send to Wiley together with the proposal. Letters from the named contributors carry real weight with a publisher's reviewers, because they show that the people listed exist, have agreed, and see the need for the book from their own field. I attach a draft to show what such a letter usually contains; please change it as you see fit, or write something quite different if you would rather.</w:t>
+      </w:r>
+    </w:p>
+    <w:p>
+      <w:pPr>
+        <w:jc w:val="both"/>
+      </w:pPr>
+      <w:r>
+        <w:t>I would be glad to go through the scope with you on a call, and there are a few practical questions on the case study that are easier to settle that way than by mail.</w:t>
+      </w:r>
+    </w:p>
+    <w:p>
+      <w:pPr>
+        <w:jc w:val="both"/>
+      </w:pPr>
+      <w:r>
+        <w:t>Yours sincerely,</w:t>
+      </w:r>
+    </w:p>
+    <w:p>
+      <w:pPr>
+        <w:jc w:val="both"/>
+      </w:pPr>
+      <w:r>
+        <w:t>Hüseyin Canseven</w:t>
+      </w:r>
+    </w:p>
+    <w:p>
+      <w:pPr>
+        <w:jc w:val="both"/>
+      </w:pPr>
+      <w:r>
+        <w:t>LUT University</w:t>
       </w:r>
     </w:p>
     <w:p>

</xml_diff>

<commit_message>
Saari: open the contribution to his network, and state the credit line
Says plainly that he is not expected to write all of it himself and
that colleagues from his own network are welcome, the same latitude
already given to Sopanen and Peltoniemi, followed by the credit line
and the promise of the detailed structure after approval.

Co-Authored-By: Claude Opus 5 <noreply@anthropic.com>
Claude-Session: https://claude.ai/code/session_01YTsySEafbpGxYLQMAGUGjT
</commit_message>
<xml_diff>
--- a/chapter1/Invitation_Emails.docx
+++ b/chapter1/Invitation_Emails.docx
@@ -560,7 +560,15 @@
         <w:jc w:val="both"/>
       </w:pPr>
       <w:r>
-        <w:t>If all three are too much, any one of them would be very welcome. The first is the one nobody else can write.</w:t>
+        <w:t>If all three are too much, any one of them would be very welcome, and the first is the one nobody else can write. We are equally open to contributions from colleagues in your own network, at [company] or elsewhere; we certainly do not expect you to write all of this yourself, and anyone you would want to bring in would be welcome.</w:t>
+      </w:r>
+    </w:p>
+    <w:p>
+      <w:pPr>
+        <w:jc w:val="both"/>
+      </w:pPr>
+      <w:r>
+        <w:t>Everyone who contributes is named at the head of the chapter, and once the publisher has approved the proposal we will send you the detailed structure and settle the division of work with you.</w:t>
       </w:r>
     </w:p>
     <w:p>

</xml_diff>

<commit_message>
Add the support letter for Paavo Rasilo
Two arguments, both his own and neither used in the other nine letters:
that a loss model is valid only for the material state it was identified
on, and that the state inside a finished machine — cut, stacked, joined,
pressed into a frame, and in a rotor under centrifugal stress — is never
that state, with every one of those effects frequency dependent and worse
at high speed, so the build factor is an admission rather than a
correction; and that rotor loss is structurally orphaned, its cause made
by the converter, its mechanism electromagnetic, its enclosure mechanical
and its consequence thermal, so the book's arrangement is what makes an
honest treatment possible.

Invitation_Emails.md records the email as sent: one step rather than two,
since he is in the same Centre of Excellence, and asking for the letter
directly.

Co-Authored-By: Claude Opus 5 <noreply@anthropic.com>
Claude-Session: https://claude.ai/code/session_01YTsySEafbpGxYLQMAGUGjT
</commit_message>
<xml_diff>
--- a/chapter1/Invitation_Emails.docx
+++ b/chapter1/Invitation_Emails.docx
@@ -1504,7 +1504,7 @@
         <w:jc w:val="both"/>
       </w:pPr>
       <w:r>
-        <w:t>*Cold approach to Tampere, two steps. Note the one gap honestly: the aerodynamic section is</w:t>
+        <w:t>*Sent (Hüseyin's version). Not a cold approach after all — he is in the same Centre of</w:t>
       </w:r>
     </w:p>
     <w:p>
@@ -1512,7 +1512,7 @@
         <w:jc w:val="both"/>
       </w:pPr>
       <w:r>
-        <w:t>not his field, and the email says so and offers a co-author for it rather than leaving him to</w:t>
+        <w:t>Excellence, so it goes in one step and asks for the letter of support directly.</w:t>
       </w:r>
     </w:p>
     <w:p>
@@ -1520,15 +1520,15 @@
         <w:jc w:val="both"/>
       </w:pPr>
       <w:r>
-        <w:t>discover it.*</w:t>
+        <w:t>Attachment: `letters/Support_Letter_Rasilo.docx`.</w:t>
       </w:r>
     </w:p>
     <w:p>
       <w:pPr>
-        <w:pStyle w:val="Heading3"/>
+        <w:jc w:val="both"/>
       </w:pPr>
       <w:r>
-        <w:t>First email — is the subject of interest?</w:t>
+        <w:t>The §9.8 gap is not spelled out here; the email says he may share the work with his group or</w:t>
       </w:r>
     </w:p>
     <w:p>
@@ -1536,7 +1536,7 @@
         <w:jc w:val="both"/>
       </w:pPr>
       <w:r>
-        <w:t>Dear Professor Rasilo,</w:t>
+        <w:t>network, and the annotated table of contents already names J. Saari for that section, so he</w:t>
       </w:r>
     </w:p>
     <w:p>
@@ -1544,16 +1544,7 @@
         <w:jc w:val="both"/>
       </w:pPr>
       <w:r>
-        <w:t xml:space="preserve">I am a researcher at LUT University working on high-speed electrical machines, and together with Ilya Petrov and Juha Pyrhönen I am preparing a proposal to Wiley-IEEE Press for a book on high-speed electrical machines and drives, written as a companion to </w:t>
-      </w:r>
-      <w:r>
-        <w:rPr>
-          <w:i/>
-        </w:rPr>
-        <w:t>Design of Rotating Electrical Machines</w:t>
-      </w:r>
-      <w:r>
-        <w:t>.</w:t>
+        <w:t>will see it there. The draft letter has him say he would bring in a co-author for the</w:t>
       </w:r>
     </w:p>
     <w:p>
@@ -1561,7 +1552,7 @@
         <w:jc w:val="both"/>
       </w:pPr>
       <w:r>
-        <w:t>The book is organised so that each chapter has a single author responsible for it, and we would like to offer you Chapter 9: Core, rotor and aerodynamic losses at high speed. About thirty pages.</w:t>
+        <w:t>aerodynamic sections rather than extend his own field into them.*</w:t>
       </w:r>
     </w:p>
     <w:p>
@@ -1569,7 +1560,7 @@
         <w:jc w:val="both"/>
       </w:pPr>
       <w:r>
-        <w:t>The premise of the chapter is that loss models fitted at or near mains frequency do not extrapolate to two kilohertz. Loss separation loses much of its meaning as the frequency rises; the soft magnetic materials have to be compared as design choices rather than as datasheet entries, thin-gauge silicon iron against cobalt iron, amorphous and composites; and the degradation that cutting, stacking and joining inflict on them is itself frequency dependent, so the correction factors in common use have no dependable basis in this range. The rotor side has equal weight: surface and harmonic losses, eddy currents in sleeves, rings and magnets, magnet segmentation, and solid-rotor loss modelling.</w:t>
+        <w:t>Hello Paavo,</w:t>
       </w:r>
     </w:p>
     <w:p>
@@ -1577,7 +1568,7 @@
         <w:jc w:val="both"/>
       </w:pPr>
       <w:r>
-        <w:t>One part of the chapter is outside your field and we would rather say so than let you find it: §9.8 covers the aerodynamic and windage losses of the air gap. Owning the chapter would mean you bring in a co-author for that section, and Juha Saari, whose correlations the field still uses, is the natural name; we can introduce you. Everyone who contributes is named at the head of the chapter.</w:t>
+        <w:t>Together with Ilya and Juha we are preparing a proposal to Wiley-IEEE Press for a book on high-speed electrical machines and drives. I believe the topic of the book is strongly aligned with our CoE project.</w:t>
       </w:r>
     </w:p>
     <w:p>
@@ -1585,7 +1576,7 @@
         <w:jc w:val="both"/>
       </w:pPr>
       <w:r>
-        <w:t>Nothing is binding at this stage: the publisher has not yet seen the proposal, and no writing would begin before a contract. For now I would simply like to know whether the subject interests you. I would gladly send you the completed introductory chapter and the annotated table of contents, or talk it through in a video call.</w:t>
+        <w:t>We started outlining the book, but we will wait for the publisher's approval before we start writing it. For the book proposal, we will initially submit a complete introductory chapter and an annotated table of contents.</w:t>
       </w:r>
     </w:p>
     <w:p>
@@ -1593,7 +1584,7 @@
         <w:jc w:val="both"/>
       </w:pPr>
       <w:r>
-        <w:t>Yours sincerely,</w:t>
+        <w:t>One chapter is about the core, and rotor losses at high speed. The premise of the chapter is that loss models fitted at or near mains frequency do not extrapolate to fews of kilohertz. Loss separation loses much of its meaning as the frequency rises. The soft magnetic materials have to be compared as design choices rather than as datasheet entries, thin-gauge silicon iron against cobalt iron, amorphous and composites; and the degradation that cutting, stacking and joining inflict on them is itself frequency dependent, so the correction factors in common use have no dependable basis in this range. The rotor side has equal weight: surface and harmonic losses, eddy currents in sleeves, rings and magnets, magnet segmentation, and solid-rotor loss modelling.</w:t>
       </w:r>
     </w:p>
     <w:p>
@@ -1601,7 +1592,7 @@
         <w:jc w:val="both"/>
       </w:pPr>
       <w:r>
-        <w:t>Hüseyin Canseven</w:t>
+        <w:t>We do not expect you to write all of it yourself. You are free to share the duties with your group or your wider network. Everyone who contributes is named at the head of the chapter. Once the publisher has approved the proposal, we will send you the detailed structure and settle the division of work with you.</w:t>
       </w:r>
     </w:p>
     <w:p>
@@ -1609,15 +1600,15 @@
         <w:jc w:val="both"/>
       </w:pPr>
       <w:r>
-        <w:t>LUT University</w:t>
+        <w:t>Could you write us a short letter of support? We would send it to the publisher together with the proposal, and we think such letters will make the application considerably stronger. A draft is attached, which you are free to change as you wish.</w:t>
       </w:r>
     </w:p>
     <w:p>
       <w:pPr>
-        <w:pStyle w:val="Heading3"/>
+        <w:jc w:val="both"/>
       </w:pPr>
       <w:r>
-        <w:t>Second email — after he has said yes</w:t>
+        <w:t>Looking forward to hearing from you.</w:t>
       </w:r>
     </w:p>
     <w:p>
@@ -1625,10 +1616,7 @@
         <w:jc w:val="both"/>
       </w:pPr>
       <w:r>
-        <w:rPr>
-          <w:i/>
-        </w:rPr>
-        <w:t>Attach the clean Chapter 1, `Annotated_TOC_for_contributors.docx` and the draft letter.</w:t>
+        <w:t>BR, Hüseyin</w:t>
       </w:r>
     </w:p>
     <w:p>

</xml_diff>

<commit_message>
Redraft the reply to Juha Saari; correct his fallback section's owner
The reply offers Chapter 2 entire under the one-chapter-one-owner rule,
in place of the three scattered sections he was first asked for, and no
longer recites the chapter's contents: the annotated table of contents
now goes with it and carries the full abstract, so the email says only
what the chapter turns on.

The fallback named Anouar Belahcen as the owner of the loss chapter he
would join as a co-author. That chapter is Paavo Rasilo's; corrected.

Support_Letter_Saari now names Upheat in the letterhead and signature
placeholders, which were written before his move was known.

Co-Authored-By: Claude Opus 5 <noreply@anthropic.com>
Claude-Session: https://claude.ai/code/session_01YTsySEafbpGxYLQMAGUGjT
</commit_message>
<xml_diff>
--- a/chapter1/Invitation_Emails.docx
+++ b/chapter1/Invitation_Emails.docx
@@ -632,7 +632,7 @@
         <w:jc w:val="both"/>
       </w:pPr>
       <w:r>
-        <w:t>Chapter 2 entire, with the windage section named as the fallback so that a no to the chapter</w:t>
+        <w:t>Chapter 2 entire, with §9.8 named as the fallback so that a no to the chapter is not a no</w:t>
       </w:r>
     </w:p>
     <w:p>
@@ -640,7 +640,7 @@
         <w:jc w:val="both"/>
       </w:pPr>
       <w:r>
-        <w:t>is not a no to the book. Attach the clean Chapter 1,</w:t>
+        <w:t>to the book. The chapter's contents are not recited here, because the annotated table of</w:t>
       </w:r>
     </w:p>
     <w:p>
@@ -648,7 +648,7 @@
         <w:jc w:val="both"/>
       </w:pPr>
       <w:r>
-        <w:t>`Annotated_TOC_for_contributors.docx` and the draft letter.*</w:t>
+        <w:t>contents carries the full abstract; the email says only what the chapter turns on.</w:t>
       </w:r>
     </w:p>
     <w:p>
@@ -656,7 +656,7 @@
         <w:jc w:val="both"/>
       </w:pPr>
       <w:r>
-        <w:t>Hi Juha,</w:t>
+        <w:t>Attach the clean Chapter 1, `Annotated_TOC_for_contributors.docx` and</w:t>
       </w:r>
     </w:p>
     <w:p>
@@ -664,7 +664,7 @@
         <w:jc w:val="both"/>
       </w:pPr>
       <w:r>
-        <w:t>Thank you, and noted on the address; I have changed it here and am writing to Upheat.</w:t>
+        <w:t>`letters/Support_Letter_Saari.docx`.*</w:t>
       </w:r>
     </w:p>
     <w:p>
@@ -672,7 +672,7 @@
         <w:jc w:val="both"/>
       </w:pPr>
       <w:r>
-        <w:t>One part is fine. Let me put a different shape of one part to you, though, because the book has changed since I wrote.</w:t>
+        <w:t>Hello Juha,</w:t>
       </w:r>
     </w:p>
     <w:p>
@@ -680,7 +680,7 @@
         <w:jc w:val="both"/>
       </w:pPr>
       <w:r>
-        <w:t>We have settled it on one rule: one chapter, one owner. A chapter divided among three or four contributors becomes three or four notations with nobody but us to reconcile them, and it gives the contributor a fragment inside somebody else's argument. So instead of three sections scattered through three chapters, I would like to offer you one chapter: Chapter 2, Applications and system architectures, thirty-four pages.</w:t>
+        <w:t>Thank you, and noted on the address — I am writing to Upheat.</w:t>
       </w:r>
     </w:p>
     <w:p>
@@ -688,7 +688,7 @@
         <w:jc w:val="both"/>
       </w:pPr>
       <w:r>
-        <w:t>That may well be less work than the three sections rather than more. It is one deliverable with one deadline and one context, instead of three that each have to be fitted into a chapter somebody else is writing. And you would own it: you decide what it contains, you decide whether to write it alone or with co-authors of your own choosing, which is where your offer of other names comes in, and you and they are named together at the head of the chapter.</w:t>
+        <w:t>One part is fine. Let me put a different shape of one part to you, though, because the book has settled since I wrote.</w:t>
       </w:r>
     </w:p>
     <w:p>
@@ -696,7 +696,7 @@
         <w:jc w:val="both"/>
       </w:pPr>
       <w:r>
-        <w:t>What the chapter has to do. It begins from the driven machine rather than the motor, because that is where the speed requirement originates: the aerodynamic optimum of a compressor or expander, not any electrical consideration, is what asks for 30 000 r/min. It then covers the gearless industrial units, compressors, aeration blowers, ORC and turbo-expanders, and the subsea and hermetic process machines. The high-temperature industrial heat pump has its own section as the driver currently pulling hardest on high-speed compression, and written from Upheat it would be new material rather than a survey; Wiley's editor asked us specifically for a focus on updated applications, so that section answers them directly. The mobile applications follow, traction, aerospace and electrically assisted turbocharging, and this is the part where a co-author would help most. The chapter closes with the architecture-selection logic, total cost of ownership against specific power, a survey of built machines, and the specification of the two machines carried through the rest of the book.</w:t>
+        <w:t>We now work on one rule: one chapter, one owner. A chapter split between three or four contributors becomes three or four notations that nobody but us can reconcile, and it leaves the contributor with a fragment inside somebody else's argument. So instead of three sections in three different chapters, I would like to offer you one chapter: Chapter 2, Applications and system architectures, thirty-four pages.</w:t>
       </w:r>
     </w:p>
     <w:p>
@@ -704,7 +704,7 @@
         <w:jc w:val="both"/>
       </w:pPr>
       <w:r>
-        <w:t>If a whole chapter is more than you want, say so plainly and there is no difficulty. The windage and air-gap section in Chapter 9 remains open and would be yours; you would come into it as Anouar Belahcen's co-author rather than through us, since he owns that chapter. Either is very welcome. I would simply rather offer you the chapter first.</w:t>
+        <w:t>That is probably less work than the three sections rather than more. It is one deliverable with one deadline and one context, instead of three that each have to be fitted into a chapter somebody else is writing. And it would be yours: you decide what it contains, and whether to write it alone or with co-authors of your own choosing, which is where your offer of other names comes in. Everyone who contributes is named at the head of the chapter.</w:t>
       </w:r>
     </w:p>
     <w:p>
@@ -712,7 +712,39 @@
         <w:jc w:val="both"/>
       </w:pPr>
       <w:r>
-        <w:t>One further thing, whenever you have had a chance to look. We are collecting short letters of support to send to Wiley with the proposal. Letters from named contributors carry real weight with a publisher's reviewers, because they show that the people listed exist and see the need for the book from their own field. I attach a draft, written for the chapter; if you prefer the smaller role, its last paragraph is the part to change, and please rewrite the rest freely.</w:t>
+        <w:t>The annotated table of contents is attached and describes the chapter in full, so let me say only what it turns on. It begins from the driven machine rather than the motor, because that is where the speed requirement originates: the aerodynamic optimum of a compressor or an expander, not any electrical consideration, is what asks for 30 000 r/min. The high-temperature industrial heat pump then has its own section, as the driver currently pulling hardest on high-speed compression, and written from Upheat that would be new material rather than a survey. Wiley's editor asked us specifically for a focus on updated applications, and that section answers them directly.</w:t>
+      </w:r>
+    </w:p>
+    <w:p>
+      <w:pPr>
+        <w:jc w:val="both"/>
+      </w:pPr>
+      <w:r>
+        <w:t>If a whole chapter is more than you want, say so plainly and there is no difficulty. The windage and air-gap section of the loss chapter remains open and would be yours; that chapter belongs to Paavo Rasilo, so you would come into it as his co-author rather than through us. Either is very welcome, and I would simply rather offer you the chapter first.</w:t>
+      </w:r>
+    </w:p>
+    <w:p>
+      <w:pPr>
+        <w:jc w:val="both"/>
+      </w:pPr>
+      <w:r>
+        <w:t>I attach the completed introductory chapter as well, so that you can see how the book reads rather than only what it covers.</w:t>
+      </w:r>
+    </w:p>
+    <w:p>
+      <w:pPr>
+        <w:jc w:val="both"/>
+      </w:pPr>
+      <w:r>
+        <w:t>Could you also write us a short letter of support? We would send it to the publisher together with the proposal, and we think such letters will make the application considerably stronger. A draft is attached, written for the chapter; if you prefer the smaller role, its last paragraph is the one to change, and please rewrite the rest as you wish.</w:t>
+      </w:r>
+    </w:p>
+    <w:p>
+      <w:pPr>
+        <w:jc w:val="both"/>
+      </w:pPr>
+      <w:r>
+        <w:t>Nothing is binding at this stage: the publisher has not yet seen the proposal, and no writing would begin before a contract.</w:t>
       </w:r>
     </w:p>
     <w:p>

</xml_diff>